<commit_message>
report for test cases and vulns fixed.
</commit_message>
<xml_diff>
--- a/templates/report_test_run.docx
+++ b/templates/report_test_run.docx
@@ -11,6 +11,9 @@
         <w:t xml:space="preserve">{{ </w:t>
       </w:r>
       <w:r>
+        <w:t>test_case.</w:t>
+      </w:r>
+      <w:r>
         <w:t>name</w:t>
       </w:r>
       <w:proofErr w:type="gramEnd"/>
@@ -29,8 +32,24 @@
     <w:p>
       <w:proofErr w:type="gramStart"/>
       <w:r>
-        <w:t>{{ description</w:t>
-      </w:r>
+        <w:t xml:space="preserve">{{ </w:t>
+      </w:r>
+      <w:proofErr w:type="spellStart"/>
+      <w:r>
+        <w:t>test</w:t>
+      </w:r>
+      <w:proofErr w:type="gramEnd"/>
+      <w:r>
+        <w:t>_</w:t>
+      </w:r>
+      <w:proofErr w:type="gramStart"/>
+      <w:r>
+        <w:t>case.</w:t>
+      </w:r>
+      <w:r>
+        <w:t>description</w:t>
+      </w:r>
+      <w:proofErr w:type="spellEnd"/>
       <w:proofErr w:type="gramEnd"/>
       <w:r>
         <w:t xml:space="preserve"> }}</w:t>
@@ -38,17 +57,28 @@
     </w:p>
     <w:p>
       <w:r>
-        <w:t xml:space="preserve">{% if </w:t>
-      </w:r>
-      <w:r>
-        <w:t>status</w:t>
-      </w:r>
-      <w:r>
-        <w:t xml:space="preserve"> </w:t>
-      </w:r>
-      <w:proofErr w:type="gramStart"/>
-      <w:r>
-        <w:t>%}</w:t>
+        <w:rPr>
+          <w:b/>
+          <w:bCs/>
+        </w:rPr>
+        <w:t>Code:</w:t>
+      </w:r>
+      <w:r>
+        <w:t xml:space="preserve"> {{ </w:t>
+      </w:r>
+      <w:proofErr w:type="spellStart"/>
+      <w:r>
+        <w:t>test_case_code</w:t>
+      </w:r>
+      <w:proofErr w:type="spellEnd"/>
+      <w:r>
+        <w:t xml:space="preserve"> }}</w:t>
+      </w:r>
+      <w:r>
+        <w:t>{% if status %}</w:t>
+      </w:r>
+      <w:r>
+        <w:t xml:space="preserve"> | </w:t>
       </w:r>
       <w:r>
         <w:rPr>
@@ -64,7 +94,6 @@
         </w:rPr>
         <w:t>tatus</w:t>
       </w:r>
-      <w:proofErr w:type="gramEnd"/>
       <w:r>
         <w:rPr>
           <w:b/>
@@ -73,57 +102,140 @@
         <w:t>:</w:t>
       </w:r>
       <w:r>
-        <w:t xml:space="preserve"> </w:t>
-      </w:r>
-      <w:proofErr w:type="gramStart"/>
-      <w:r>
-        <w:t xml:space="preserve">{{ </w:t>
-      </w:r>
-      <w:proofErr w:type="spellStart"/>
-      <w:r>
-        <w:t>status</w:t>
-      </w:r>
-      <w:proofErr w:type="gramEnd"/>
-      <w:r>
-        <w:t xml:space="preserve"> }}</w:t>
-      </w:r>
-      <w:r>
-        <w:t xml:space="preserve"> </w:t>
-      </w:r>
-      <w:r>
-        <w:t>{% e</w:t>
-      </w:r>
-      <w:proofErr w:type="spellEnd"/>
-      <w:r>
-        <w:t>ndif %}</w:t>
+        <w:t xml:space="preserve"> {{ status }} {% endif %}</w:t>
+      </w:r>
+      <w:r>
+        <w:br/>
+      </w:r>
+      <w:r>
+        <w:t xml:space="preserve">{% for b in bound %} </w:t>
+      </w:r>
+      <w:r>
+        <w:br/>
+      </w:r>
+      <w:r>
+        <w:t xml:space="preserve">Target: {{ </w:t>
+      </w:r>
+      <w:proofErr w:type="spellStart"/>
+      <w:r>
+        <w:t>b.kind</w:t>
+      </w:r>
+      <w:proofErr w:type="spellEnd"/>
+      <w:r>
+        <w:t xml:space="preserve"> }} </w:t>
+      </w:r>
+      <w:r>
+        <w:br/>
+        <w:t xml:space="preserve">{% if </w:t>
+      </w:r>
+      <w:proofErr w:type="spellStart"/>
+      <w:r>
+        <w:t>b.kind</w:t>
+      </w:r>
+      <w:proofErr w:type="spellEnd"/>
+      <w:r>
+        <w:t xml:space="preserve"> == “peripheral” %}{% set part = </w:t>
+      </w:r>
+      <w:proofErr w:type="spellStart"/>
+      <w:r>
+        <w:t>b.object_id.split</w:t>
+      </w:r>
+      <w:proofErr w:type="spellEnd"/>
+      <w:r>
+        <w:t>(“:”) %}Device</w:t>
+      </w:r>
+      <w:r>
+        <w:t xml:space="preserve"> hostname</w:t>
+      </w:r>
+      <w:r>
+        <w:t>: {{part[0]}}</w:t>
+      </w:r>
+      <w:r>
+        <w:br/>
+        <w:t>Peripheral: {{part[1]}}{% e</w:t>
+      </w:r>
+      <w:r>
+        <w:t>lse</w:t>
+      </w:r>
+      <w:r>
+        <w:t xml:space="preserve"> %}</w:t>
+      </w:r>
+      <w:r>
+        <w:t>Device h</w:t>
+      </w:r>
+      <w:r>
+        <w:t>ostname</w:t>
+      </w:r>
+      <w:r>
+        <w:t xml:space="preserve">: {{ </w:t>
+      </w:r>
+      <w:proofErr w:type="spellStart"/>
+      <w:r>
+        <w:t>b.object_id</w:t>
+      </w:r>
+      <w:proofErr w:type="spellEnd"/>
+      <w:r>
+        <w:t xml:space="preserve"> }} </w:t>
+      </w:r>
+      <w:r>
+        <w:t>{% endif %}</w:t>
+      </w:r>
+      <w:r>
+        <w:t xml:space="preserve">{% </w:t>
+      </w:r>
+      <w:proofErr w:type="spellStart"/>
+      <w:r>
+        <w:t>endfor</w:t>
+      </w:r>
+      <w:proofErr w:type="spellEnd"/>
+      <w:r>
+        <w:t xml:space="preserve"> %}</w:t>
       </w:r>
     </w:p>
     <w:p>
       <w:r>
-        <w:t xml:space="preserve">Code: </w:t>
+        <w:t xml:space="preserve">Notes: </w:t>
+      </w:r>
+      <w:r>
+        <w:t xml:space="preserve">{% if notes %} </w:t>
       </w:r>
       <w:proofErr w:type="gramStart"/>
       <w:r>
-        <w:t>{{ code</w:t>
+        <w:t>{</w:t>
+      </w:r>
+      <w:r>
+        <w:t>{ notes</w:t>
       </w:r>
       <w:proofErr w:type="gramEnd"/>
       <w:r>
-        <w:t xml:space="preserve"> }}</w:t>
+        <w:t xml:space="preserve"> }</w:t>
+      </w:r>
+      <w:r>
+        <w:t>}</w:t>
+      </w:r>
+      <w:r>
+        <w:t xml:space="preserve"> {% else %} N/A {% endif %}</w:t>
       </w:r>
     </w:p>
     <w:p>
       <w:r>
-        <w:t>{{ bound }}</w:t>
-      </w:r>
-    </w:p>
-    <w:p>
-      <w:pPr>
-        <w:rPr>
-          <w:rStyle w:val="Heading3Char"/>
-        </w:rPr>
-      </w:pPr>
-      <w:r>
-        <w:t xml:space="preserve">{% if steps </w:t>
+        <w:t xml:space="preserve">{% if </w:t>
+      </w:r>
+      <w:proofErr w:type="spellStart"/>
+      <w:r>
+        <w:t>test_</w:t>
+      </w:r>
+      <w:proofErr w:type="gramStart"/>
+      <w:r>
+        <w:t>case.</w:t>
+      </w:r>
+      <w:r>
+        <w:t>steps</w:t>
+      </w:r>
+      <w:proofErr w:type="spellEnd"/>
+      <w:proofErr w:type="gramEnd"/>
+      <w:r>
+        <w:t xml:space="preserve"> </w:t>
       </w:r>
       <w:proofErr w:type="gramStart"/>
       <w:r>
@@ -142,8 +254,16 @@
         </w:rPr>
         <w:t xml:space="preserve"> Steps</w:t>
       </w:r>
-    </w:p>
-    <w:p>
+      <w:r>
+        <w:rPr>
+          <w:rStyle w:val="Heading3Char"/>
+          <w:rFonts w:eastAsiaTheme="minorHAnsi" w:cstheme="minorBidi"/>
+          <w:color w:val="auto"/>
+          <w:sz w:val="24"/>
+          <w:szCs w:val="24"/>
+        </w:rPr>
+        <w:br/>
+      </w:r>
       <w:r>
         <w:t xml:space="preserve">{% for </w:t>
       </w:r>
@@ -153,7 +273,23 @@
       </w:r>
       <w:proofErr w:type="spellEnd"/>
       <w:r>
-        <w:t xml:space="preserve"> in steps %}</w:t>
+        <w:t xml:space="preserve"> in </w:t>
+      </w:r>
+      <w:proofErr w:type="spellStart"/>
+      <w:r>
+        <w:t>test_</w:t>
+      </w:r>
+      <w:proofErr w:type="gramStart"/>
+      <w:r>
+        <w:t>case.</w:t>
+      </w:r>
+      <w:r>
+        <w:t>steps</w:t>
+      </w:r>
+      <w:proofErr w:type="spellEnd"/>
+      <w:proofErr w:type="gramEnd"/>
+      <w:r>
+        <w:t xml:space="preserve"> %}</w:t>
       </w:r>
     </w:p>
     <w:p>
@@ -222,17 +358,6 @@
         <w:ind w:left="360"/>
       </w:pPr>
       <w:r>
-        <w:t xml:space="preserve">{% if </w:t>
-      </w:r>
-      <w:proofErr w:type="spellStart"/>
-      <w:r>
-        <w:t>rs.description</w:t>
-      </w:r>
-      <w:proofErr w:type="spellEnd"/>
-      <w:r>
-        <w:t xml:space="preserve"> %}</w:t>
-      </w:r>
-      <w:r>
         <w:rPr>
           <w:b/>
           <w:bCs/>
@@ -240,7 +365,10 @@
         <w:t>Description:</w:t>
       </w:r>
       <w:r>
-        <w:t xml:space="preserve"> {{</w:t>
+        <w:t xml:space="preserve"> </w:t>
+      </w:r>
+      <w:r>
+        <w:t xml:space="preserve">{% if </w:t>
       </w:r>
       <w:proofErr w:type="spellStart"/>
       <w:r>
@@ -248,19 +376,24 @@
       </w:r>
       <w:proofErr w:type="spellEnd"/>
       <w:r>
-        <w:t>}}{% endif %}</w:t>
+        <w:t xml:space="preserve"> %} {{</w:t>
+      </w:r>
+      <w:proofErr w:type="spellStart"/>
+      <w:r>
+        <w:t>rs.description</w:t>
+      </w:r>
+      <w:proofErr w:type="spellEnd"/>
+      <w:r>
+        <w:t>}}</w:t>
+      </w:r>
+      <w:r>
+        <w:t xml:space="preserve">{% else %} N/A </w:t>
+      </w:r>
+      <w:r>
+        <w:t>{% endif %}</w:t>
       </w:r>
       <w:r>
         <w:br/>
-        <w:t xml:space="preserve">{% if </w:t>
-      </w:r>
-      <w:proofErr w:type="spellStart"/>
-      <w:r>
-        <w:t>rs.tool</w:t>
-      </w:r>
-      <w:proofErr w:type="spellEnd"/>
-      <w:r>
-        <w:t xml:space="preserve"> %} </w:t>
       </w:r>
       <w:r>
         <w:rPr>
@@ -270,7 +403,10 @@
         <w:t>Command:</w:t>
       </w:r>
       <w:r>
-        <w:t xml:space="preserve"> {{ </w:t>
+        <w:t xml:space="preserve"> </w:t>
+      </w:r>
+      <w:r>
+        <w:t xml:space="preserve">{% if </w:t>
       </w:r>
       <w:proofErr w:type="spellStart"/>
       <w:r>
@@ -278,7 +414,21 @@
       </w:r>
       <w:proofErr w:type="spellEnd"/>
       <w:r>
-        <w:t xml:space="preserve"> }}{% endif %} {% if </w:t>
+        <w:t xml:space="preserve"> %} {{ </w:t>
+      </w:r>
+      <w:proofErr w:type="spellStart"/>
+      <w:r>
+        <w:t>rs.tool</w:t>
+      </w:r>
+      <w:proofErr w:type="spellEnd"/>
+      <w:r>
+        <w:t xml:space="preserve"> }}</w:t>
+      </w:r>
+      <w:r>
+        <w:t xml:space="preserve">{% else %} N/A </w:t>
+      </w:r>
+      <w:r>
+        <w:t xml:space="preserve">{% endif %} {% if </w:t>
       </w:r>
       <w:proofErr w:type="spellStart"/>
       <w:r>
@@ -294,10 +444,28 @@
       </w:r>
       <w:proofErr w:type="spellEnd"/>
       <w:r>
-        <w:t>) }}{% endif %}</w:t>
+        <w:t>) }}</w:t>
+      </w:r>
+      <w:r>
+        <w:t xml:space="preserve"> </w:t>
+      </w:r>
+      <w:r>
+        <w:t>{% endif %}</w:t>
       </w:r>
       <w:r>
         <w:br/>
+      </w:r>
+      <w:r>
+        <w:rPr>
+          <w:b/>
+          <w:bCs/>
+        </w:rPr>
+        <w:t>Vulnerable Output:</w:t>
+      </w:r>
+      <w:r>
+        <w:t xml:space="preserve"> </w:t>
+      </w:r>
+      <w:r>
         <w:t xml:space="preserve">{% if </w:t>
       </w:r>
       <w:proofErr w:type="spellStart"/>
@@ -306,7 +474,7 @@
       </w:r>
       <w:proofErr w:type="spellEnd"/>
       <w:r>
-        <w:t xml:space="preserve"> %}- Vulnerable Output: {{ </w:t>
+        <w:t xml:space="preserve"> %} {{ </w:t>
       </w:r>
       <w:proofErr w:type="spellStart"/>
       <w:r>
@@ -314,10 +482,31 @@
       </w:r>
       <w:proofErr w:type="spellEnd"/>
       <w:r>
-        <w:t xml:space="preserve"> }}{% endif %}</w:t>
+        <w:t xml:space="preserve"> }}</w:t>
+      </w:r>
+      <w:r>
+        <w:t>{% else %} N/A</w:t>
+      </w:r>
+      <w:r>
+        <w:t xml:space="preserve"> </w:t>
+      </w:r>
+      <w:r>
+        <w:t>{% endif %}</w:t>
       </w:r>
       <w:r>
         <w:br/>
+      </w:r>
+      <w:r>
+        <w:rPr>
+          <w:b/>
+          <w:bCs/>
+        </w:rPr>
+        <w:t>Fixed Output:</w:t>
+      </w:r>
+      <w:r>
+        <w:t xml:space="preserve"> </w:t>
+      </w:r>
+      <w:r>
         <w:t xml:space="preserve">{% if </w:t>
       </w:r>
       <w:proofErr w:type="spellStart"/>
@@ -326,7 +515,7 @@
       </w:r>
       <w:proofErr w:type="spellEnd"/>
       <w:r>
-        <w:t xml:space="preserve"> %}- Fixed Output: {{ </w:t>
+        <w:t xml:space="preserve"> %} {{ </w:t>
       </w:r>
       <w:proofErr w:type="spellStart"/>
       <w:r>
@@ -334,7 +523,16 @@
       </w:r>
       <w:proofErr w:type="spellEnd"/>
       <w:r>
-        <w:t xml:space="preserve"> }}{% endif %}</w:t>
+        <w:t xml:space="preserve"> }}</w:t>
+      </w:r>
+      <w:r>
+        <w:t>{% else %} N/A</w:t>
+      </w:r>
+      <w:r>
+        <w:t xml:space="preserve"> </w:t>
+      </w:r>
+      <w:r>
+        <w:t>{% endif %}</w:t>
       </w:r>
     </w:p>
     <w:p>
@@ -368,17 +566,17 @@
   <w:abstractNum w:abstractNumId="0" w15:restartNumberingAfterBreak="0">
     <w:nsid w:val="78970110"/>
     <w:multiLevelType w:val="multilevel"/>
-    <w:tmpl w:val="04090021"/>
+    <w:tmpl w:val="9844D08C"/>
     <w:lvl w:ilvl="0">
       <w:start w:val="1"/>
-      <w:numFmt w:val="bullet"/>
-      <w:lvlText w:val=""/>
+      <w:numFmt w:val="decimal"/>
+      <w:lvlText w:val="%1."/>
       <w:lvlJc w:val="left"/>
       <w:pPr>
         <w:ind w:left="360" w:hanging="360"/>
       </w:pPr>
       <w:rPr>
-        <w:rFonts w:ascii="Wingdings" w:hAnsi="Wingdings" w:hint="default"/>
+        <w:rFonts w:hint="default"/>
       </w:rPr>
     </w:lvl>
     <w:lvl w:ilvl="1">

</xml_diff>

<commit_message>
added test cases, and format changes on report template.
</commit_message>
<xml_diff>
--- a/templates/report_test_run.docx
+++ b/templates/report_test_run.docx
@@ -4,9 +4,8 @@
   <w:body>
     <w:p>
       <w:pPr>
-        <w:pStyle w:val="Heading2"/>
+        <w:pStyle w:val="Heading3"/>
       </w:pPr>
-      <w:proofErr w:type="gramStart"/>
       <w:r>
         <w:t xml:space="preserve">{{ </w:t>
       </w:r>
@@ -14,16 +13,51 @@
         <w:t>test_case.</w:t>
       </w:r>
       <w:r>
-        <w:t>name</w:t>
-      </w:r>
-      <w:proofErr w:type="gramEnd"/>
-      <w:r>
-        <w:t xml:space="preserve"> }}</w:t>
+        <w:t>name }}</w:t>
+      </w:r>
+      <w:r>
+        <w:t>{% for b in bound %}</w:t>
+      </w:r>
+      <w:r>
+        <w:t xml:space="preserve">{%if </w:t>
+      </w:r>
+      <w:proofErr w:type="spellStart"/>
+      <w:r>
+        <w:t>b.kind</w:t>
+      </w:r>
+      <w:proofErr w:type="spellEnd"/>
+      <w:r>
+        <w:t>==”peripheral” %</w:t>
+      </w:r>
+      <w:r>
+        <w:t>}</w:t>
+      </w:r>
+      <w:r>
+        <w:t xml:space="preserve">{% set part = </w:t>
+      </w:r>
+      <w:proofErr w:type="spellStart"/>
+      <w:r>
+        <w:t>b.object_id.split</w:t>
+      </w:r>
+      <w:proofErr w:type="spellEnd"/>
+      <w:r>
+        <w:t>(“:”) %} ({{part[1]}}){% endif %}</w:t>
+      </w:r>
+      <w:r>
+        <w:t xml:space="preserve">{% </w:t>
+      </w:r>
+      <w:proofErr w:type="spellStart"/>
+      <w:r>
+        <w:t>endfor</w:t>
+      </w:r>
+      <w:proofErr w:type="spellEnd"/>
+      <w:r>
+        <w:t xml:space="preserve"> %}</w:t>
       </w:r>
     </w:p>
     <w:p>
       <w:pPr>
-        <w:pStyle w:val="Heading3"/>
+        <w:pStyle w:val="Heading4"/>
       </w:pPr>
       <w:r>
         <w:t>Description</w:t>
@@ -112,8 +146,6 @@
       </w:r>
       <w:r>
         <w:br/>
-      </w:r>
-      <w:r>
         <w:t xml:space="preserve">Target: {{ </w:t>
       </w:r>
       <w:proofErr w:type="spellStart"/>
@@ -243,14 +275,14 @@
       </w:r>
       <w:r>
         <w:rPr>
-          <w:rStyle w:val="Heading3Char"/>
+          <w:rStyle w:val="Heading4Char"/>
         </w:rPr>
         <w:t>Reproduction</w:t>
       </w:r>
       <w:proofErr w:type="gramEnd"/>
       <w:r>
         <w:rPr>
-          <w:rStyle w:val="Heading3Char"/>
+          <w:rStyle w:val="Heading4Char"/>
         </w:rPr>
         <w:t xml:space="preserve"> Steps</w:t>
       </w:r>
@@ -485,10 +517,7 @@
         <w:t xml:space="preserve"> }}</w:t>
       </w:r>
       <w:r>
-        <w:t>{% else %} N/A</w:t>
-      </w:r>
-      <w:r>
-        <w:t xml:space="preserve"> </w:t>
+        <w:t xml:space="preserve">{% else %} N/A </w:t>
       </w:r>
       <w:r>
         <w:t>{% endif %}</w:t>
@@ -526,10 +555,7 @@
         <w:t xml:space="preserve"> }}</w:t>
       </w:r>
       <w:r>
-        <w:t>{% else %} N/A</w:t>
-      </w:r>
-      <w:r>
-        <w:t xml:space="preserve"> </w:t>
+        <w:t xml:space="preserve">{% else %} N/A </w:t>
       </w:r>
       <w:r>
         <w:t>{% endif %}</w:t>
@@ -548,9 +574,6 @@
         <w:t xml:space="preserve"> %} {% endif %}</w:t>
       </w:r>
     </w:p>
-    <w:p/>
-    <w:p/>
-    <w:p/>
     <w:sectPr>
       <w:pgSz w:w="12240" w:h="15840"/>
       <w:pgMar w:top="1440" w:right="1440" w:bottom="1440" w:left="1440" w:header="720" w:footer="720" w:gutter="0"/>
@@ -1155,7 +1178,6 @@
     <w:next w:val="Normal"/>
     <w:link w:val="Heading4Char"/>
     <w:uiPriority w:val="9"/>
-    <w:semiHidden/>
     <w:unhideWhenUsed/>
     <w:qFormat/>
     <w:rsid w:val="007C1873"/>
@@ -1352,7 +1374,6 @@
     <w:basedOn w:val="DefaultParagraphFont"/>
     <w:link w:val="Heading4"/>
     <w:uiPriority w:val="9"/>
-    <w:semiHidden/>
     <w:rsid w:val="007C1873"/>
     <w:rPr>
       <w:rFonts w:eastAsiaTheme="majorEastAsia" w:cstheme="majorBidi"/>

</xml_diff>